<commit_message>
edited project abstract and project registration form
</commit_message>
<xml_diff>
--- a/Project Registratrion Form.docx
+++ b/Project Registratrion Form.docx
@@ -4,7 +4,7 @@
   <w:body>
     <w:p>
       <w:pPr>
-        <w:spacing w:line="240" w:lineRule="auto"/>
+        <w:spacing w:line="40" w:lineRule="exact" w:before="0" w:after="0"/>
         <w:jc w:val="center"/>
         <w:rPr>
           <w:rFonts w:ascii="Times New Roman" w:eastAsia="Times New Roman" w:hAnsi="Times New Roman" w:cs="Times New Roman"/>
@@ -15,7 +15,7 @@
     </w:p>
     <w:p>
       <w:pPr>
-        <w:spacing w:line="240" w:lineRule="auto"/>
+        <w:spacing w:line="240" w:lineRule="auto" w:before="120" w:after="80"/>
         <w:jc w:val="center"/>
         <w:rPr>
           <w:rFonts w:ascii="Times New Roman" w:eastAsia="Times New Roman" w:hAnsi="Times New Roman" w:cs="Times New Roman"/>
@@ -53,7 +53,7 @@
     </w:p>
     <w:p>
       <w:pPr>
-        <w:spacing w:line="240" w:lineRule="auto"/>
+        <w:spacing w:line="240" w:lineRule="auto" w:before="0" w:after="160"/>
         <w:jc w:val="right"/>
         <w:rPr>
           <w:rFonts w:ascii="Times New Roman" w:eastAsia="Times New Roman" w:hAnsi="Times New Roman" w:cs="Times New Roman"/>
@@ -72,7 +72,7 @@
     </w:p>
     <w:p>
       <w:pPr>
-        <w:spacing w:after="0"/>
+        <w:spacing w:after="0" w:before="0"/>
         <w:rPr>
           <w:rFonts w:ascii="Times New Roman" w:eastAsia="Times New Roman" w:hAnsi="Times New Roman" w:cs="Times New Roman"/>
           <w:sz w:val="24"/>
@@ -82,6 +82,7 @@
     </w:p>
     <w:p>
       <w:pPr>
+        <w:spacing w:before="160" w:after="160"/>
         <w:jc w:val="center"/>
         <w:rPr>
           <w:rFonts w:ascii="Times New Roman" w:eastAsia="Times New Roman" w:hAnsi="Times New Roman" w:cs="Times New Roman"/>
@@ -92,7 +93,8 @@
       <w:r>
         <w:rPr>
           <w:rFonts w:ascii="Times New Roman" w:eastAsia="Times New Roman" w:hAnsi="Times New Roman" w:cs="Times New Roman"/>
-          <w:sz w:val="32"/>
+          <w:b/>
+          <w:sz w:val="28"/>
           <w:szCs w:val="32"/>
         </w:rPr>
         <w:t>PROJECT REGISTRATION FORM</w:t>
@@ -100,6 +102,8 @@
     </w:p>
     <w:p>
       <w:pPr>
+        <w:spacing w:before="40" w:after="40" w:line="240" w:lineRule="auto"/>
+        <w:jc w:val="left"/>
         <w:rPr>
           <w:rFonts w:ascii="Times New Roman" w:eastAsia="Times New Roman" w:hAnsi="Times New Roman" w:cs="Times New Roman"/>
           <w:sz w:val="32"/>
@@ -126,7 +130,8 @@
     </w:p>
     <w:p>
       <w:pPr>
-        <w:jc w:val="both"/>
+        <w:spacing w:before="40" w:after="40" w:line="240" w:lineRule="auto"/>
+        <w:jc w:val="left"/>
         <w:rPr>
           <w:rFonts w:ascii="Times New Roman" w:eastAsia="Times New Roman" w:hAnsi="Times New Roman" w:cs="Times New Roman"/>
           <w:b/>
@@ -154,7 +159,8 @@
     </w:p>
     <w:p>
       <w:pPr>
-        <w:jc w:val="both"/>
+        <w:spacing w:before="40" w:after="160" w:line="240" w:lineRule="auto"/>
+        <w:jc w:val="left"/>
         <w:rPr>
           <w:rFonts w:ascii="Times New Roman" w:eastAsia="Times New Roman" w:hAnsi="Times New Roman" w:cs="Times New Roman"/>
           <w:b/>
@@ -205,9 +211,7 @@
       </w:tblGrid>
       <w:tr>
         <w:trPr>
-          <w:cantSplit/>
-          <w:trHeight w:val="470"/>
-          <w:tblHeader/>
+          <w:trHeight w:val="380" w:hRule="atLeast"/>
           <w:jc w:val="center"/>
         </w:trPr>
         <w:tc>
@@ -216,6 +220,7 @@
           </w:tcPr>
           <w:p>
             <w:pPr>
+              <w:spacing w:before="40" w:after="40" w:line="240" w:lineRule="auto"/>
               <w:jc w:val="center"/>
               <w:rPr>
                 <w:rFonts w:ascii="Times New Roman" w:eastAsia="Times New Roman" w:hAnsi="Times New Roman" w:cs="Times New Roman"/>
@@ -227,8 +232,8 @@
             <w:r>
               <w:rPr>
                 <w:rFonts w:ascii="Times New Roman" w:eastAsia="Times New Roman" w:hAnsi="Times New Roman" w:cs="Times New Roman"/>
-                <w:b/>
-                <w:sz w:val="24"/>
+                <w:b w:val="0"/>
+                <w:sz w:val="22"/>
                 <w:szCs w:val="24"/>
               </w:rPr>
               <w:t>S. No.</w:t>
@@ -241,6 +246,7 @@
           </w:tcPr>
           <w:p>
             <w:pPr>
+              <w:spacing w:before="40" w:after="40" w:line="240" w:lineRule="auto"/>
               <w:jc w:val="center"/>
               <w:rPr>
                 <w:rFonts w:ascii="Times New Roman" w:eastAsia="Times New Roman" w:hAnsi="Times New Roman" w:cs="Times New Roman"/>
@@ -252,8 +258,8 @@
             <w:r>
               <w:rPr>
                 <w:rFonts w:ascii="Times New Roman" w:eastAsia="Times New Roman" w:hAnsi="Times New Roman" w:cs="Times New Roman"/>
-                <w:b/>
-                <w:sz w:val="24"/>
+                <w:b w:val="0"/>
+                <w:sz w:val="22"/>
                 <w:szCs w:val="24"/>
               </w:rPr>
               <w:t>Roll No</w:t>
@@ -266,6 +272,7 @@
           </w:tcPr>
           <w:p>
             <w:pPr>
+              <w:spacing w:before="40" w:after="40" w:line="240" w:lineRule="auto"/>
               <w:jc w:val="center"/>
               <w:rPr>
                 <w:rFonts w:ascii="Times New Roman" w:eastAsia="Times New Roman" w:hAnsi="Times New Roman" w:cs="Times New Roman"/>
@@ -277,8 +284,8 @@
             <w:r>
               <w:rPr>
                 <w:rFonts w:ascii="Times New Roman" w:eastAsia="Times New Roman" w:hAnsi="Times New Roman" w:cs="Times New Roman"/>
-                <w:b/>
-                <w:sz w:val="24"/>
+                <w:b w:val="0"/>
+                <w:sz w:val="22"/>
                 <w:szCs w:val="24"/>
               </w:rPr>
               <w:t>Name of the Student</w:t>
@@ -291,6 +298,7 @@
           </w:tcPr>
           <w:p>
             <w:pPr>
+              <w:spacing w:before="40" w:after="40" w:line="240" w:lineRule="auto"/>
               <w:jc w:val="center"/>
               <w:rPr>
                 <w:rFonts w:ascii="Times New Roman" w:eastAsia="Times New Roman" w:hAnsi="Times New Roman" w:cs="Times New Roman"/>
@@ -302,8 +310,8 @@
             <w:r>
               <w:rPr>
                 <w:rFonts w:ascii="Times New Roman" w:eastAsia="Times New Roman" w:hAnsi="Times New Roman" w:cs="Times New Roman"/>
-                <w:b/>
-                <w:sz w:val="24"/>
+                <w:b w:val="0"/>
+                <w:sz w:val="22"/>
                 <w:szCs w:val="24"/>
               </w:rPr>
               <w:t>E-mail id</w:t>
@@ -316,6 +324,7 @@
           </w:tcPr>
           <w:p>
             <w:pPr>
+              <w:spacing w:before="40" w:after="40" w:line="240" w:lineRule="auto"/>
               <w:jc w:val="center"/>
               <w:rPr>
                 <w:rFonts w:ascii="Times New Roman" w:eastAsia="Times New Roman" w:hAnsi="Times New Roman" w:cs="Times New Roman"/>
@@ -327,8 +336,8 @@
             <w:r>
               <w:rPr>
                 <w:rFonts w:ascii="Times New Roman" w:eastAsia="Times New Roman" w:hAnsi="Times New Roman" w:cs="Times New Roman"/>
-                <w:b/>
-                <w:sz w:val="24"/>
+                <w:b w:val="0"/>
+                <w:sz w:val="22"/>
                 <w:szCs w:val="24"/>
               </w:rPr>
               <w:t>Mobile Number</w:t>
@@ -338,9 +347,7 @@
       </w:tr>
       <w:tr>
         <w:trPr>
-          <w:cantSplit/>
-          <w:trHeight w:val="960"/>
-          <w:tblHeader/>
+          <w:trHeight w:val="380" w:hRule="atLeast"/>
           <w:jc w:val="center"/>
         </w:trPr>
         <w:tc>
@@ -349,14 +356,21 @@
           </w:tcPr>
           <w:p>
             <w:pPr>
+              <w:spacing w:before="40" w:after="40" w:line="240" w:lineRule="auto"/>
               <w:jc w:val="center"/>
             </w:pPr>
-            <w:r/>
-            <w:r>
-              <w:rPr>
-                <w:rFonts w:ascii="Times New Roman" w:hAnsi="Times New Roman"/>
-                <w:b w:val="0"/>
-                <w:sz w:val="24"/>
+            <w:r>
+              <w:rPr>
+                <w:rFonts w:ascii="Times New Roman" w:hAnsi="Times New Roman"/>
+                <w:b w:val="0"/>
+                <w:sz w:val="22"/>
+              </w:rPr>
+            </w:r>
+            <w:r>
+              <w:rPr>
+                <w:rFonts w:ascii="Times New Roman" w:hAnsi="Times New Roman"/>
+                <w:b w:val="0"/>
+                <w:sz w:val="22"/>
               </w:rPr>
               <w:t>1</w:t>
             </w:r>
@@ -368,14 +382,21 @@
           </w:tcPr>
           <w:p>
             <w:pPr>
+              <w:spacing w:before="40" w:after="40" w:line="240" w:lineRule="auto"/>
               <w:jc w:val="center"/>
             </w:pPr>
-            <w:r/>
-            <w:r>
-              <w:rPr>
-                <w:rFonts w:ascii="Times New Roman" w:hAnsi="Times New Roman"/>
-                <w:b w:val="0"/>
-                <w:sz w:val="24"/>
+            <w:r>
+              <w:rPr>
+                <w:rFonts w:ascii="Times New Roman" w:hAnsi="Times New Roman"/>
+                <w:b w:val="0"/>
+                <w:sz w:val="22"/>
+              </w:rPr>
+            </w:r>
+            <w:r>
+              <w:rPr>
+                <w:rFonts w:ascii="Times New Roman" w:hAnsi="Times New Roman"/>
+                <w:b w:val="0"/>
+                <w:sz w:val="22"/>
               </w:rPr>
               <w:t>23J41A05EH</w:t>
             </w:r>
@@ -387,14 +408,21 @@
           </w:tcPr>
           <w:p>
             <w:pPr>
+              <w:spacing w:before="40" w:after="40" w:line="240" w:lineRule="auto"/>
               <w:jc w:val="center"/>
             </w:pPr>
-            <w:r/>
-            <w:r>
-              <w:rPr>
-                <w:rFonts w:ascii="Times New Roman" w:hAnsi="Times New Roman"/>
-                <w:b w:val="0"/>
-                <w:sz w:val="24"/>
+            <w:r>
+              <w:rPr>
+                <w:rFonts w:ascii="Times New Roman" w:hAnsi="Times New Roman"/>
+                <w:b w:val="0"/>
+                <w:sz w:val="22"/>
+              </w:rPr>
+            </w:r>
+            <w:r>
+              <w:rPr>
+                <w:rFonts w:ascii="Times New Roman" w:hAnsi="Times New Roman"/>
+                <w:b w:val="0"/>
+                <w:sz w:val="22"/>
               </w:rPr>
               <w:t>MD. Shoaib Akther</w:t>
             </w:r>
@@ -406,14 +434,21 @@
           </w:tcPr>
           <w:p>
             <w:pPr>
+              <w:spacing w:before="40" w:after="40" w:line="240" w:lineRule="auto"/>
               <w:jc w:val="center"/>
             </w:pPr>
-            <w:r/>
-            <w:r>
-              <w:rPr>
-                <w:rFonts w:ascii="Times New Roman" w:hAnsi="Times New Roman"/>
-                <w:b w:val="0"/>
-                <w:sz w:val="24"/>
+            <w:r>
+              <w:rPr>
+                <w:rFonts w:ascii="Times New Roman" w:hAnsi="Times New Roman"/>
+                <w:b w:val="0"/>
+                <w:sz w:val="22"/>
+              </w:rPr>
+            </w:r>
+            <w:r>
+              <w:rPr>
+                <w:rFonts w:ascii="Times New Roman" w:hAnsi="Times New Roman"/>
+                <w:b w:val="0"/>
+                <w:sz w:val="22"/>
               </w:rPr>
               <w:t>shoaib9542186823@gmail.com</w:t>
             </w:r>
@@ -425,14 +460,21 @@
           </w:tcPr>
           <w:p>
             <w:pPr>
+              <w:spacing w:before="40" w:after="40" w:line="240" w:lineRule="auto"/>
               <w:jc w:val="center"/>
             </w:pPr>
-            <w:r/>
-            <w:r>
-              <w:rPr>
-                <w:rFonts w:ascii="Times New Roman" w:hAnsi="Times New Roman"/>
-                <w:b w:val="0"/>
-                <w:sz w:val="24"/>
+            <w:r>
+              <w:rPr>
+                <w:rFonts w:ascii="Times New Roman" w:hAnsi="Times New Roman"/>
+                <w:b w:val="0"/>
+                <w:sz w:val="22"/>
+              </w:rPr>
+            </w:r>
+            <w:r>
+              <w:rPr>
+                <w:rFonts w:ascii="Times New Roman" w:hAnsi="Times New Roman"/>
+                <w:b w:val="0"/>
+                <w:sz w:val="22"/>
               </w:rPr>
               <w:t>7207590213</w:t>
             </w:r>
@@ -441,9 +483,7 @@
       </w:tr>
       <w:tr>
         <w:trPr>
-          <w:cantSplit/>
-          <w:trHeight w:val="832"/>
-          <w:tblHeader/>
+          <w:trHeight w:val="380" w:hRule="atLeast"/>
           <w:jc w:val="center"/>
         </w:trPr>
         <w:tc>
@@ -452,14 +492,21 @@
           </w:tcPr>
           <w:p>
             <w:pPr>
+              <w:spacing w:before="40" w:after="40" w:line="240" w:lineRule="auto"/>
               <w:jc w:val="center"/>
             </w:pPr>
-            <w:r/>
-            <w:r>
-              <w:rPr>
-                <w:rFonts w:ascii="Times New Roman" w:hAnsi="Times New Roman"/>
-                <w:b w:val="0"/>
-                <w:sz w:val="24"/>
+            <w:r>
+              <w:rPr>
+                <w:rFonts w:ascii="Times New Roman" w:hAnsi="Times New Roman"/>
+                <w:b w:val="0"/>
+                <w:sz w:val="22"/>
+              </w:rPr>
+            </w:r>
+            <w:r>
+              <w:rPr>
+                <w:rFonts w:ascii="Times New Roman" w:hAnsi="Times New Roman"/>
+                <w:b w:val="0"/>
+                <w:sz w:val="22"/>
               </w:rPr>
               <w:t>2</w:t>
             </w:r>
@@ -471,14 +518,21 @@
           </w:tcPr>
           <w:p>
             <w:pPr>
+              <w:spacing w:before="40" w:after="40" w:line="240" w:lineRule="auto"/>
               <w:jc w:val="center"/>
             </w:pPr>
-            <w:r/>
-            <w:r>
-              <w:rPr>
-                <w:rFonts w:ascii="Times New Roman" w:hAnsi="Times New Roman"/>
-                <w:b w:val="0"/>
-                <w:sz w:val="24"/>
+            <w:r>
+              <w:rPr>
+                <w:rFonts w:ascii="Times New Roman" w:hAnsi="Times New Roman"/>
+                <w:b w:val="0"/>
+                <w:sz w:val="22"/>
+              </w:rPr>
+            </w:r>
+            <w:r>
+              <w:rPr>
+                <w:rFonts w:ascii="Times New Roman" w:hAnsi="Times New Roman"/>
+                <w:b w:val="0"/>
+                <w:sz w:val="22"/>
               </w:rPr>
               <w:t>23J41A05EJ</w:t>
             </w:r>
@@ -490,14 +544,21 @@
           </w:tcPr>
           <w:p>
             <w:pPr>
+              <w:spacing w:before="40" w:after="40" w:line="240" w:lineRule="auto"/>
               <w:jc w:val="center"/>
             </w:pPr>
-            <w:r/>
-            <w:r>
-              <w:rPr>
-                <w:rFonts w:ascii="Times New Roman" w:hAnsi="Times New Roman"/>
-                <w:b w:val="0"/>
-                <w:sz w:val="24"/>
+            <w:r>
+              <w:rPr>
+                <w:rFonts w:ascii="Times New Roman" w:hAnsi="Times New Roman"/>
+                <w:b w:val="0"/>
+                <w:sz w:val="22"/>
+              </w:rPr>
+            </w:r>
+            <w:r>
+              <w:rPr>
+                <w:rFonts w:ascii="Times New Roman" w:hAnsi="Times New Roman"/>
+                <w:b w:val="0"/>
+                <w:sz w:val="22"/>
               </w:rPr>
               <w:t>Suhasini</w:t>
             </w:r>
@@ -509,14 +570,21 @@
           </w:tcPr>
           <w:p>
             <w:pPr>
+              <w:spacing w:before="40" w:after="40" w:line="240" w:lineRule="auto"/>
               <w:jc w:val="center"/>
             </w:pPr>
-            <w:r/>
-            <w:r>
-              <w:rPr>
-                <w:rFonts w:ascii="Times New Roman" w:hAnsi="Times New Roman"/>
-                <w:b w:val="0"/>
-                <w:sz w:val="24"/>
+            <w:r>
+              <w:rPr>
+                <w:rFonts w:ascii="Times New Roman" w:hAnsi="Times New Roman"/>
+                <w:b w:val="0"/>
+                <w:sz w:val="22"/>
+              </w:rPr>
+            </w:r>
+            <w:r>
+              <w:rPr>
+                <w:rFonts w:ascii="Times New Roman" w:hAnsi="Times New Roman"/>
+                <w:b w:val="0"/>
+                <w:sz w:val="22"/>
               </w:rPr>
               <w:t>shuhasini@gmail.com</w:t>
             </w:r>
@@ -528,14 +596,21 @@
           </w:tcPr>
           <w:p>
             <w:pPr>
+              <w:spacing w:before="40" w:after="40" w:line="240" w:lineRule="auto"/>
               <w:jc w:val="center"/>
             </w:pPr>
-            <w:r/>
-            <w:r>
-              <w:rPr>
-                <w:rFonts w:ascii="Times New Roman" w:hAnsi="Times New Roman"/>
-                <w:b w:val="0"/>
-                <w:sz w:val="24"/>
+            <w:r>
+              <w:rPr>
+                <w:rFonts w:ascii="Times New Roman" w:hAnsi="Times New Roman"/>
+                <w:b w:val="0"/>
+                <w:sz w:val="22"/>
+              </w:rPr>
+            </w:r>
+            <w:r>
+              <w:rPr>
+                <w:rFonts w:ascii="Times New Roman" w:hAnsi="Times New Roman"/>
+                <w:b w:val="0"/>
+                <w:sz w:val="22"/>
               </w:rPr>
               <w:t>9866295829</w:t>
             </w:r>
@@ -544,9 +619,7 @@
       </w:tr>
       <w:tr>
         <w:trPr>
-          <w:cantSplit/>
-          <w:trHeight w:val="844"/>
-          <w:tblHeader/>
+          <w:trHeight w:val="380" w:hRule="atLeast"/>
           <w:jc w:val="center"/>
         </w:trPr>
         <w:tc>
@@ -555,14 +628,21 @@
           </w:tcPr>
           <w:p>
             <w:pPr>
+              <w:spacing w:before="40" w:after="40" w:line="240" w:lineRule="auto"/>
               <w:jc w:val="center"/>
             </w:pPr>
-            <w:r/>
-            <w:r>
-              <w:rPr>
-                <w:rFonts w:ascii="Times New Roman" w:hAnsi="Times New Roman"/>
-                <w:b w:val="0"/>
-                <w:sz w:val="24"/>
+            <w:r>
+              <w:rPr>
+                <w:rFonts w:ascii="Times New Roman" w:hAnsi="Times New Roman"/>
+                <w:b w:val="0"/>
+                <w:sz w:val="22"/>
+              </w:rPr>
+            </w:r>
+            <w:r>
+              <w:rPr>
+                <w:rFonts w:ascii="Times New Roman" w:hAnsi="Times New Roman"/>
+                <w:b w:val="0"/>
+                <w:sz w:val="22"/>
               </w:rPr>
               <w:t>3</w:t>
             </w:r>
@@ -574,14 +654,21 @@
           </w:tcPr>
           <w:p>
             <w:pPr>
+              <w:spacing w:before="40" w:after="40" w:line="240" w:lineRule="auto"/>
               <w:jc w:val="center"/>
             </w:pPr>
-            <w:r/>
-            <w:r>
-              <w:rPr>
-                <w:rFonts w:ascii="Times New Roman" w:hAnsi="Times New Roman"/>
-                <w:b w:val="0"/>
-                <w:sz w:val="24"/>
+            <w:r>
+              <w:rPr>
+                <w:rFonts w:ascii="Times New Roman" w:hAnsi="Times New Roman"/>
+                <w:b w:val="0"/>
+                <w:sz w:val="22"/>
+              </w:rPr>
+            </w:r>
+            <w:r>
+              <w:rPr>
+                <w:rFonts w:ascii="Times New Roman" w:hAnsi="Times New Roman"/>
+                <w:b w:val="0"/>
+                <w:sz w:val="22"/>
               </w:rPr>
               <w:t>24J45A0549</w:t>
             </w:r>
@@ -593,14 +680,21 @@
           </w:tcPr>
           <w:p>
             <w:pPr>
+              <w:spacing w:before="40" w:after="40" w:line="240" w:lineRule="auto"/>
               <w:jc w:val="center"/>
             </w:pPr>
-            <w:r/>
-            <w:r>
-              <w:rPr>
-                <w:rFonts w:ascii="Times New Roman" w:hAnsi="Times New Roman"/>
-                <w:b w:val="0"/>
-                <w:sz w:val="24"/>
+            <w:r>
+              <w:rPr>
+                <w:rFonts w:ascii="Times New Roman" w:hAnsi="Times New Roman"/>
+                <w:b w:val="0"/>
+                <w:sz w:val="22"/>
+              </w:rPr>
+            </w:r>
+            <w:r>
+              <w:rPr>
+                <w:rFonts w:ascii="Times New Roman" w:hAnsi="Times New Roman"/>
+                <w:b w:val="0"/>
+                <w:sz w:val="22"/>
               </w:rPr>
               <w:t>Md. Yakub Pasha</w:t>
             </w:r>
@@ -612,14 +706,21 @@
           </w:tcPr>
           <w:p>
             <w:pPr>
+              <w:spacing w:before="40" w:after="40" w:line="240" w:lineRule="auto"/>
               <w:jc w:val="center"/>
             </w:pPr>
-            <w:r/>
-            <w:r>
-              <w:rPr>
-                <w:rFonts w:ascii="Times New Roman" w:hAnsi="Times New Roman"/>
-                <w:b w:val="0"/>
-                <w:sz w:val="24"/>
+            <w:r>
+              <w:rPr>
+                <w:rFonts w:ascii="Times New Roman" w:hAnsi="Times New Roman"/>
+                <w:b w:val="0"/>
+                <w:sz w:val="22"/>
+              </w:rPr>
+            </w:r>
+            <w:r>
+              <w:rPr>
+                <w:rFonts w:ascii="Times New Roman" w:hAnsi="Times New Roman"/>
+                <w:b w:val="0"/>
+                <w:sz w:val="22"/>
               </w:rPr>
               <w:t>yakub@gmail.com</w:t>
             </w:r>
@@ -631,14 +732,21 @@
           </w:tcPr>
           <w:p>
             <w:pPr>
+              <w:spacing w:before="40" w:after="40" w:line="240" w:lineRule="auto"/>
               <w:jc w:val="center"/>
             </w:pPr>
-            <w:r/>
-            <w:r>
-              <w:rPr>
-                <w:rFonts w:ascii="Times New Roman" w:hAnsi="Times New Roman"/>
-                <w:b w:val="0"/>
-                <w:sz w:val="24"/>
+            <w:r>
+              <w:rPr>
+                <w:rFonts w:ascii="Times New Roman" w:hAnsi="Times New Roman"/>
+                <w:b w:val="0"/>
+                <w:sz w:val="22"/>
+              </w:rPr>
+            </w:r>
+            <w:r>
+              <w:rPr>
+                <w:rFonts w:ascii="Times New Roman" w:hAnsi="Times New Roman"/>
+                <w:b w:val="0"/>
+                <w:sz w:val="22"/>
               </w:rPr>
               <w:t>9398930871</w:t>
             </w:r>
@@ -647,9 +755,7 @@
       </w:tr>
       <w:tr>
         <w:trPr>
-          <w:cantSplit/>
-          <w:trHeight w:val="842"/>
-          <w:tblHeader/>
+          <w:trHeight w:val="380" w:hRule="atLeast"/>
           <w:jc w:val="center"/>
         </w:trPr>
         <w:tc>
@@ -658,14 +764,21 @@
           </w:tcPr>
           <w:p>
             <w:pPr>
+              <w:spacing w:before="40" w:after="40" w:line="240" w:lineRule="auto"/>
               <w:jc w:val="center"/>
             </w:pPr>
-            <w:r/>
-            <w:r>
-              <w:rPr>
-                <w:rFonts w:ascii="Times New Roman" w:hAnsi="Times New Roman"/>
-                <w:b w:val="0"/>
-                <w:sz w:val="24"/>
+            <w:r>
+              <w:rPr>
+                <w:rFonts w:ascii="Times New Roman" w:hAnsi="Times New Roman"/>
+                <w:b w:val="0"/>
+                <w:sz w:val="22"/>
+              </w:rPr>
+            </w:r>
+            <w:r>
+              <w:rPr>
+                <w:rFonts w:ascii="Times New Roman" w:hAnsi="Times New Roman"/>
+                <w:b w:val="0"/>
+                <w:sz w:val="22"/>
               </w:rPr>
               <w:t>4</w:t>
             </w:r>
@@ -677,14 +790,21 @@
           </w:tcPr>
           <w:p>
             <w:pPr>
+              <w:spacing w:before="40" w:after="40" w:line="240" w:lineRule="auto"/>
               <w:jc w:val="center"/>
             </w:pPr>
-            <w:r/>
-            <w:r>
-              <w:rPr>
-                <w:rFonts w:ascii="Times New Roman" w:hAnsi="Times New Roman"/>
-                <w:b w:val="0"/>
-                <w:sz w:val="24"/>
+            <w:r>
+              <w:rPr>
+                <w:rFonts w:ascii="Times New Roman" w:hAnsi="Times New Roman"/>
+                <w:b w:val="0"/>
+                <w:sz w:val="22"/>
+              </w:rPr>
+            </w:r>
+            <w:r>
+              <w:rPr>
+                <w:rFonts w:ascii="Times New Roman" w:hAnsi="Times New Roman"/>
+                <w:b w:val="0"/>
+                <w:sz w:val="22"/>
               </w:rPr>
               <w:t>23J41A05FE</w:t>
             </w:r>
@@ -696,14 +816,21 @@
           </w:tcPr>
           <w:p>
             <w:pPr>
+              <w:spacing w:before="40" w:after="40" w:line="240" w:lineRule="auto"/>
               <w:jc w:val="center"/>
             </w:pPr>
-            <w:r/>
-            <w:r>
-              <w:rPr>
-                <w:rFonts w:ascii="Times New Roman" w:hAnsi="Times New Roman"/>
-                <w:b w:val="0"/>
-                <w:sz w:val="24"/>
+            <w:r>
+              <w:rPr>
+                <w:rFonts w:ascii="Times New Roman" w:hAnsi="Times New Roman"/>
+                <w:b w:val="0"/>
+                <w:sz w:val="22"/>
+              </w:rPr>
+            </w:r>
+            <w:r>
+              <w:rPr>
+                <w:rFonts w:ascii="Times New Roman" w:hAnsi="Times New Roman"/>
+                <w:b w:val="0"/>
+                <w:sz w:val="22"/>
               </w:rPr>
               <w:t>Abhinaya</w:t>
             </w:r>
@@ -715,14 +842,21 @@
           </w:tcPr>
           <w:p>
             <w:pPr>
+              <w:spacing w:before="40" w:after="40" w:line="240" w:lineRule="auto"/>
               <w:jc w:val="center"/>
             </w:pPr>
-            <w:r/>
-            <w:r>
-              <w:rPr>
-                <w:rFonts w:ascii="Times New Roman" w:hAnsi="Times New Roman"/>
-                <w:b w:val="0"/>
-                <w:sz w:val="24"/>
+            <w:r>
+              <w:rPr>
+                <w:rFonts w:ascii="Times New Roman" w:hAnsi="Times New Roman"/>
+                <w:b w:val="0"/>
+                <w:sz w:val="22"/>
+              </w:rPr>
+            </w:r>
+            <w:r>
+              <w:rPr>
+                <w:rFonts w:ascii="Times New Roman" w:hAnsi="Times New Roman"/>
+                <w:b w:val="0"/>
+                <w:sz w:val="22"/>
               </w:rPr>
               <w:t>abhinaya@gmail.com</w:t>
             </w:r>
@@ -734,14 +868,21 @@
           </w:tcPr>
           <w:p>
             <w:pPr>
+              <w:spacing w:before="40" w:after="40" w:line="240" w:lineRule="auto"/>
               <w:jc w:val="center"/>
             </w:pPr>
-            <w:r/>
-            <w:r>
-              <w:rPr>
-                <w:rFonts w:ascii="Times New Roman" w:hAnsi="Times New Roman"/>
-                <w:b w:val="0"/>
-                <w:sz w:val="24"/>
+            <w:r>
+              <w:rPr>
+                <w:rFonts w:ascii="Times New Roman" w:hAnsi="Times New Roman"/>
+                <w:b w:val="0"/>
+                <w:sz w:val="22"/>
+              </w:rPr>
+            </w:r>
+            <w:r>
+              <w:rPr>
+                <w:rFonts w:ascii="Times New Roman" w:hAnsi="Times New Roman"/>
+                <w:b w:val="0"/>
+                <w:sz w:val="22"/>
               </w:rPr>
               <w:t>7995023493</w:t>
             </w:r>
@@ -751,6 +892,7 @@
     </w:tbl>
     <w:p>
       <w:pPr>
+        <w:spacing w:before="0" w:after="0"/>
         <w:jc w:val="both"/>
         <w:rPr>
           <w:rFonts w:ascii="Times New Roman" w:eastAsia="Times New Roman" w:hAnsi="Times New Roman" w:cs="Times New Roman"/>
@@ -761,6 +903,7 @@
     </w:p>
     <w:p>
       <w:pPr>
+        <w:spacing w:before="0" w:after="0"/>
         <w:rPr>
           <w:rFonts w:ascii="Times New Roman" w:eastAsia="Times New Roman" w:hAnsi="Times New Roman" w:cs="Times New Roman"/>
           <w:sz w:val="24"/>
@@ -770,6 +913,7 @@
     </w:p>
     <w:p>
       <w:pPr>
+        <w:spacing w:before="0" w:after="360"/>
         <w:rPr>
           <w:rFonts w:ascii="Times New Roman" w:eastAsia="Times New Roman" w:hAnsi="Times New Roman" w:cs="Times New Roman"/>
           <w:sz w:val="24"/>
@@ -779,129 +923,61 @@
     </w:p>
     <w:p>
       <w:pPr>
+        <w:spacing w:before="120" w:after="0" w:line="240" w:lineRule="auto"/>
+        <w:jc w:val="left"/>
         <w:rPr>
           <w:rFonts w:ascii="Times New Roman" w:eastAsia="Times New Roman" w:hAnsi="Times New Roman" w:cs="Times New Roman"/>
           <w:sz w:val="24"/>
           <w:szCs w:val="24"/>
         </w:rPr>
+        <w:tabs>
+          <w:tab w:val="center" w:pos="5112"/>
+          <w:tab w:val="right" w:pos="10224"/>
+        </w:tabs>
       </w:pPr>
+      <w:r/>
       <w:r>
         <w:rPr>
-          <w:rFonts w:ascii="Times New Roman" w:eastAsia="Times New Roman" w:hAnsi="Times New Roman" w:cs="Times New Roman"/>
+          <w:rFonts w:ascii="Times New Roman" w:hAnsi="Times New Roman"/>
           <w:b/>
           <w:sz w:val="24"/>
-          <w:szCs w:val="24"/>
         </w:rPr>
         <w:t>Project Guide</w:t>
       </w:r>
       <w:r>
         <w:rPr>
-          <w:rFonts w:ascii="Times New Roman" w:eastAsia="Times New Roman" w:hAnsi="Times New Roman" w:cs="Times New Roman"/>
           <w:sz w:val="24"/>
-          <w:szCs w:val="24"/>
-        </w:rPr>
-        <w:tab/>
-        <w:t xml:space="preserve">  </w:t>
-      </w:r>
-      <w:r>
-        <w:rPr>
-          <w:rFonts w:ascii="Times New Roman" w:eastAsia="Times New Roman" w:hAnsi="Times New Roman" w:cs="Times New Roman"/>
-          <w:sz w:val="24"/>
-          <w:szCs w:val="24"/>
         </w:rPr>
         <w:tab/>
       </w:r>
       <w:r>
         <w:rPr>
-          <w:rFonts w:ascii="Times New Roman" w:eastAsia="Times New Roman" w:hAnsi="Times New Roman" w:cs="Times New Roman"/>
+          <w:rFonts w:ascii="Times New Roman" w:hAnsi="Times New Roman"/>
           <w:b/>
           <w:sz w:val="24"/>
-          <w:szCs w:val="24"/>
-        </w:rPr>
-        <w:t xml:space="preserve">                </w:t>
-      </w:r>
-      <w:r>
-        <w:rPr>
-          <w:rFonts w:ascii="Times New Roman" w:eastAsia="Times New Roman" w:hAnsi="Times New Roman" w:cs="Times New Roman"/>
-          <w:b/>
-          <w:sz w:val="24"/>
-          <w:szCs w:val="24"/>
         </w:rPr>
         <w:t>Project Coordinator</w:t>
       </w:r>
       <w:r>
         <w:rPr>
-          <w:rFonts w:ascii="Times New Roman" w:eastAsia="Times New Roman" w:hAnsi="Times New Roman" w:cs="Times New Roman"/>
           <w:sz w:val="24"/>
-          <w:szCs w:val="24"/>
-        </w:rPr>
-        <w:t xml:space="preserve"> </w:t>
-      </w:r>
-      <w:r>
-        <w:rPr>
-          <w:rFonts w:ascii="Times New Roman" w:eastAsia="Times New Roman" w:hAnsi="Times New Roman" w:cs="Times New Roman"/>
-          <w:sz w:val="24"/>
-          <w:szCs w:val="24"/>
         </w:rPr>
         <w:tab/>
       </w:r>
       <w:r>
         <w:rPr>
-          <w:rFonts w:ascii="Times New Roman" w:eastAsia="Times New Roman" w:hAnsi="Times New Roman" w:cs="Times New Roman"/>
-          <w:sz w:val="24"/>
-          <w:szCs w:val="24"/>
-        </w:rPr>
-        <w:tab/>
-      </w:r>
-      <w:r>
-        <w:rPr>
-          <w:rFonts w:ascii="Times New Roman" w:eastAsia="Times New Roman" w:hAnsi="Times New Roman" w:cs="Times New Roman"/>
-          <w:sz w:val="24"/>
-          <w:szCs w:val="24"/>
-        </w:rPr>
-        <w:tab/>
-      </w:r>
-      <w:r>
-        <w:rPr>
-          <w:rFonts w:ascii="Times New Roman" w:eastAsia="Times New Roman" w:hAnsi="Times New Roman" w:cs="Times New Roman"/>
-          <w:sz w:val="24"/>
-          <w:szCs w:val="24"/>
-        </w:rPr>
-        <w:tab/>
-      </w:r>
-      <w:r>
-        <w:rPr>
-          <w:rFonts w:ascii="Times New Roman" w:eastAsia="Times New Roman" w:hAnsi="Times New Roman" w:cs="Times New Roman"/>
+          <w:rFonts w:ascii="Times New Roman" w:hAnsi="Times New Roman"/>
           <w:b/>
           <w:sz w:val="24"/>
-          <w:szCs w:val="24"/>
-        </w:rPr>
-        <w:t xml:space="preserve">   </w:t>
-      </w:r>
-      <w:r>
-        <w:rPr>
-          <w:rFonts w:ascii="Times New Roman" w:eastAsia="Times New Roman" w:hAnsi="Times New Roman" w:cs="Times New Roman"/>
-          <w:b/>
-          <w:sz w:val="24"/>
-          <w:szCs w:val="24"/>
-        </w:rPr>
-        <w:t>HOD</w:t>
-      </w:r>
-      <w:r>
-        <w:rPr>
-          <w:rFonts w:ascii="Times New Roman" w:eastAsia="Times New Roman" w:hAnsi="Times New Roman" w:cs="Times New Roman"/>
-          <w:b/>
-          <w:sz w:val="24"/>
-          <w:szCs w:val="24"/>
-        </w:rPr>
-        <w:t>-CSE</w:t>
+        </w:rPr>
+        <w:t>HOD-CSE</w:t>
       </w:r>
     </w:p>
     <w:sectPr>
       <w:headerReference w:type="default" r:id="rId8"/>
       <w:footerReference w:type="default" r:id="rId9"/>
       <w:pgSz w:w="12240" w:h="15840"/>
-      <w:pgMar w:top="1440" w:right="1440" w:bottom="900" w:left="1440" w:header="720" w:footer="720" w:gutter="0"/>
+      <w:pgMar w:top="576" w:right="1008" w:bottom="576" w:left="1008" w:header="360" w:footer="288" w:gutter="0"/>
       <w:pgNumType w:start="1"/>
       <w:cols w:space="720"/>
     </w:sectPr>
@@ -938,20 +1014,25 @@
 <w:ftr xmlns:wpc="http://schemas.microsoft.com/office/word/2010/wordprocessingCanvas" xmlns:mc="http://schemas.openxmlformats.org/markup-compatibility/2006" xmlns:o="urn:schemas-microsoft-com:office:office" xmlns:r="http://schemas.openxmlformats.org/officeDocument/2006/relationships" xmlns:m="http://schemas.openxmlformats.org/officeDocument/2006/math" xmlns:v="urn:schemas-microsoft-com:vml" xmlns:wp14="http://schemas.microsoft.com/office/word/2010/wordprocessingDrawing" xmlns:wp="http://schemas.openxmlformats.org/drawingml/2006/wordprocessingDrawing" xmlns:w10="urn:schemas-microsoft-com:office:word" xmlns:w="http://schemas.openxmlformats.org/wordprocessingml/2006/main" xmlns:w14="http://schemas.microsoft.com/office/word/2010/wordml" xmlns:wpg="http://schemas.microsoft.com/office/word/2010/wordprocessingGroup" xmlns:wpi="http://schemas.microsoft.com/office/word/2010/wordprocessingInk" xmlns:wne="http://schemas.microsoft.com/office/word/2006/wordml" xmlns:wps="http://schemas.microsoft.com/office/word/2010/wordprocessingShape" mc:Ignorable="w14 wp14">
   <w:p>
     <w:pPr>
+      <w:spacing w:before="0" w:after="0" w:line="40" w:lineRule="exact"/>
       <w:rPr>
         <w:b/>
       </w:rPr>
     </w:pPr>
     <w:r>
       <w:rPr>
-        <w:b/>
+        <w:sz w:val="4"/>
       </w:rPr>
-      <w:t>Vision</w:t>
     </w:r>
   </w:p>
   <w:p>
+    <w:pPr>
+      <w:spacing w:before="0" w:after="0" w:line="40" w:lineRule="exact"/>
+    </w:pPr>
     <w:r>
-      <w:t>To attain global standards in Computer Science and Engineering education, training and research to meet the growing needs of the industry with socio-economic and ethical considerations.</w:t>
+      <w:rPr>
+        <w:sz w:val="4"/>
+      </w:rPr>
     </w:r>
   </w:p>
   <w:p>
@@ -967,11 +1048,16 @@
         <w:tab w:val="center" w:pos="4680"/>
         <w:tab w:val="right" w:pos="9360"/>
       </w:tabs>
-      <w:spacing w:after="0" w:line="240" w:lineRule="auto"/>
+      <w:spacing w:after="0" w:line="40" w:lineRule="exact" w:before="0"/>
       <w:rPr>
         <w:color w:val="000000"/>
       </w:rPr>
     </w:pPr>
+    <w:r>
+      <w:rPr>
+        <w:sz w:val="4"/>
+      </w:rPr>
+    </w:r>
   </w:p>
 </w:ftr>
 </file>
@@ -1013,7 +1099,7 @@
         <w:right w:val="nil"/>
         <w:between w:val="nil"/>
       </w:pBdr>
-      <w:spacing w:after="0"/>
+      <w:spacing w:after="0" w:before="0"/>
     </w:pPr>
   </w:p>
   <w:tbl>
@@ -1044,7 +1130,7 @@
               <w:tab w:val="center" w:pos="4680"/>
               <w:tab w:val="right" w:pos="9360"/>
             </w:tabs>
-            <w:spacing w:after="0" w:line="240" w:lineRule="auto"/>
+            <w:spacing w:after="0" w:line="240" w:lineRule="auto" w:before="0"/>
             <w:jc w:val="center"/>
             <w:rPr>
               <w:rFonts w:ascii="Times New Roman" w:eastAsia="Times New Roman" w:hAnsi="Times New Roman" w:cs="Times New Roman"/>
@@ -1110,7 +1196,7 @@
               <w:tab w:val="center" w:pos="4680"/>
               <w:tab w:val="right" w:pos="9360"/>
             </w:tabs>
-            <w:spacing w:after="0" w:line="240" w:lineRule="auto"/>
+            <w:spacing w:after="0" w:line="240" w:lineRule="auto" w:before="0"/>
             <w:jc w:val="center"/>
             <w:rPr>
               <w:rFonts w:ascii="Times New Roman" w:eastAsia="Times New Roman" w:hAnsi="Times New Roman" w:cs="Times New Roman"/>
@@ -1135,7 +1221,7 @@
               <w:tab w:val="center" w:pos="4680"/>
               <w:tab w:val="right" w:pos="9360"/>
             </w:tabs>
-            <w:spacing w:after="0" w:line="240" w:lineRule="auto"/>
+            <w:spacing w:after="0" w:line="240" w:lineRule="auto" w:before="0"/>
             <w:jc w:val="center"/>
             <w:rPr>
               <w:rFonts w:ascii="Times New Roman" w:eastAsia="Times New Roman" w:hAnsi="Times New Roman" w:cs="Times New Roman"/>
@@ -1164,7 +1250,7 @@
               <w:tab w:val="center" w:pos="4680"/>
               <w:tab w:val="right" w:pos="9360"/>
             </w:tabs>
-            <w:spacing w:after="0" w:line="240" w:lineRule="auto"/>
+            <w:spacing w:after="0" w:line="240" w:lineRule="auto" w:before="0"/>
             <w:jc w:val="center"/>
             <w:rPr>
               <w:rFonts w:ascii="Times New Roman" w:eastAsia="Times New Roman" w:hAnsi="Times New Roman" w:cs="Times New Roman"/>
@@ -1260,7 +1346,7 @@
               <w:tab w:val="center" w:pos="4680"/>
               <w:tab w:val="right" w:pos="9360"/>
             </w:tabs>
-            <w:spacing w:after="0" w:line="240" w:lineRule="auto"/>
+            <w:spacing w:after="0" w:line="240" w:lineRule="auto" w:before="0"/>
             <w:jc w:val="center"/>
             <w:rPr>
               <w:rFonts w:ascii="Times New Roman" w:eastAsia="Times New Roman" w:hAnsi="Times New Roman" w:cs="Times New Roman"/>
@@ -1327,7 +1413,7 @@
         <w:tab w:val="center" w:pos="4680"/>
         <w:tab w:val="right" w:pos="9360"/>
       </w:tabs>
-      <w:spacing w:after="0" w:line="240" w:lineRule="auto"/>
+      <w:spacing w:after="0" w:line="240" w:lineRule="auto" w:before="0"/>
       <w:rPr>
         <w:color w:val="000000"/>
       </w:rPr>

</xml_diff>